<commit_message>
modified brief.md and task1.dock
</commit_message>
<xml_diff>
--- a/assgn2/AlgoViz task1.docx
+++ b/assgn2/AlgoViz task1.docx
@@ -1025,17 +1025,12 @@
           </w:tcPr>
           <w:p>
             <w:proofErr w:type="spellStart"/>
-            <w:proofErr w:type="gramStart"/>
             <w:r>
               <w:t>getComplexity</w:t>
             </w:r>
             <w:proofErr w:type="spellEnd"/>
             <w:r>
-              <w:t>(</w:t>
-            </w:r>
-            <w:proofErr w:type="gramEnd"/>
-            <w:r>
-              <w:t>)</w:t>
+              <w:t>()</w:t>
             </w:r>
           </w:p>
         </w:tc>
@@ -1156,17 +1151,12 @@
           </w:tcPr>
           <w:p>
             <w:proofErr w:type="spellStart"/>
-            <w:proofErr w:type="gramStart"/>
             <w:r>
               <w:t>executeAlgorithm</w:t>
             </w:r>
             <w:proofErr w:type="spellEnd"/>
             <w:r>
-              <w:t>(</w:t>
-            </w:r>
-            <w:proofErr w:type="gramEnd"/>
-            <w:r>
-              <w:t>)</w:t>
+              <w:t>()</w:t>
             </w:r>
           </w:p>
         </w:tc>
@@ -1208,17 +1198,12 @@
           </w:tcPr>
           <w:p>
             <w:proofErr w:type="spellStart"/>
-            <w:proofErr w:type="gramStart"/>
             <w:r>
               <w:t>visualizeAlgorithm</w:t>
             </w:r>
             <w:proofErr w:type="spellEnd"/>
             <w:r>
-              <w:t>(</w:t>
-            </w:r>
-            <w:proofErr w:type="gramEnd"/>
-            <w:r>
-              <w:t>)</w:t>
+              <w:t>()</w:t>
             </w:r>
           </w:p>
         </w:tc>
@@ -1260,17 +1245,12 @@
           </w:tcPr>
           <w:p>
             <w:proofErr w:type="spellStart"/>
-            <w:proofErr w:type="gramStart"/>
             <w:r>
               <w:t>getVisualization</w:t>
             </w:r>
             <w:proofErr w:type="spellEnd"/>
             <w:r>
-              <w:t>(</w:t>
-            </w:r>
-            <w:proofErr w:type="gramEnd"/>
-            <w:r>
-              <w:t>)</w:t>
+              <w:t>()</w:t>
             </w:r>
           </w:p>
         </w:tc>
@@ -1390,17 +1370,12 @@
           </w:tcPr>
           <w:p>
             <w:proofErr w:type="spellStart"/>
-            <w:proofErr w:type="gramStart"/>
             <w:r>
               <w:t>saveHistory</w:t>
             </w:r>
             <w:proofErr w:type="spellEnd"/>
             <w:r>
-              <w:t>(</w:t>
-            </w:r>
-            <w:proofErr w:type="gramEnd"/>
-            <w:r>
-              <w:t>)</w:t>
+              <w:t>()</w:t>
             </w:r>
           </w:p>
         </w:tc>
@@ -1442,17 +1417,12 @@
           </w:tcPr>
           <w:p>
             <w:proofErr w:type="spellStart"/>
-            <w:proofErr w:type="gramStart"/>
             <w:r>
               <w:t>trackProgress</w:t>
             </w:r>
             <w:proofErr w:type="spellEnd"/>
             <w:r>
-              <w:t>(</w:t>
-            </w:r>
-            <w:proofErr w:type="gramEnd"/>
-            <w:r>
-              <w:t>)</w:t>
+              <w:t>()</w:t>
             </w:r>
           </w:p>
         </w:tc>
@@ -1526,17 +1496,12 @@
         <w:t xml:space="preserve">Central Operation: </w:t>
       </w:r>
       <w:proofErr w:type="spellStart"/>
-      <w:proofErr w:type="gramStart"/>
       <w:r>
         <w:t>executeAlgorithm</w:t>
       </w:r>
       <w:proofErr w:type="spellEnd"/>
       <w:r>
-        <w:t>(</w:t>
-      </w:r>
-      <w:proofErr w:type="gramEnd"/>
-      <w:r>
-        <w:t>)</w:t>
+        <w:t>()</w:t>
       </w:r>
     </w:p>
     <w:p>
@@ -1723,13 +1688,8 @@
           </w:tcPr>
           <w:p>
             <w:r>
-              <w:t xml:space="preserve">Success or </w:t>
-            </w:r>
-            <w:proofErr w:type="gramStart"/>
-            <w:r>
-              <w:t>Failed</w:t>
-            </w:r>
-            <w:proofErr w:type="gramEnd"/>
+              <w:t>Success or Failed</w:t>
+            </w:r>
           </w:p>
         </w:tc>
       </w:tr>
@@ -2221,10 +2181,7 @@
           </w:tcPr>
           <w:p>
             <w:r>
-              <w:t>P</w:t>
-            </w:r>
-            <w:r>
-              <w:t>ass</w:t>
+              <w:t>Pass</w:t>
             </w:r>
           </w:p>
         </w:tc>
@@ -2704,10 +2661,7 @@
           </w:tcPr>
           <w:p>
             <w:r>
-              <w:t>pa</w:t>
-            </w:r>
-            <w:r>
-              <w:t>ss</w:t>
+              <w:t>pass</w:t>
             </w:r>
           </w:p>
         </w:tc>
@@ -2842,10 +2796,7 @@
           </w:tcPr>
           <w:p>
             <w:r>
-              <w:t>p</w:t>
-            </w:r>
-            <w:r>
-              <w:t>artial</w:t>
+              <w:t>partial</w:t>
             </w:r>
           </w:p>
         </w:tc>
@@ -2890,10 +2841,7 @@
           </w:tcPr>
           <w:p>
             <w:r>
-              <w:t>pa</w:t>
-            </w:r>
-            <w:r>
-              <w:t>rtial</w:t>
+              <w:t>partial</w:t>
             </w:r>
           </w:p>
         </w:tc>
@@ -3115,10 +3063,7 @@
           </w:tcPr>
           <w:p>
             <w:r>
-              <w:t>pa</w:t>
-            </w:r>
-            <w:r>
-              <w:t>rtial</w:t>
+              <w:t>partial</w:t>
             </w:r>
           </w:p>
         </w:tc>
@@ -3163,10 +3108,7 @@
           </w:tcPr>
           <w:p>
             <w:r>
-              <w:t>pa</w:t>
-            </w:r>
-            <w:r>
-              <w:t>rtial</w:t>
+              <w:t>partial</w:t>
             </w:r>
           </w:p>
         </w:tc>
@@ -3253,6 +3195,11 @@
         <w:t>Cross-service dependencies should use stable API operations.</w:t>
       </w:r>
     </w:p>
+    <w:p/>
+    <w:p/>
+    <w:p/>
+    <w:p/>
+    <w:p/>
     <w:p/>
     <w:sectPr>
       <w:pgSz w:w="11906" w:h="16838"/>
@@ -4930,6 +4877,7 @@
   <w:style w:type="character" w:default="1" w:styleId="DefaultParagraphFont">
     <w:name w:val="Default Paragraph Font"/>
     <w:uiPriority w:val="1"/>
+    <w:semiHidden/>
     <w:unhideWhenUsed/>
   </w:style>
   <w:style w:type="table" w:default="1" w:styleId="TableNormal">

</xml_diff>